<commit_message>
Switch track topic to B (AI Wealth Assistant) across README, docs and submission files
Co-Authored-By: Claude Opus 5.5 <noreply@anthropic.com>
</commit_message>
<xml_diff>
--- a/docs/Habilin-Security-Self-Assessment.docx
+++ b/docs/Habilin-Security-Self-Assessment.docx
@@ -113,7 +113,7 @@
               <w:rPr>
                 <w:color w:val="172B36"/>
               </w:rPr>
-              <w:t xml:space="preserve">International AI Track · Topic A provisional</w:t>
+              <w:t xml:space="preserve">International AI Track · Topic B provisional</w:t>
             </w:r>
           </w:p>
         </w:tc>
@@ -287,7 +287,7 @@
         <w:rPr>
           <w:color w:val="172B36"/>
         </w:rPr>
-        <w:t xml:space="preserve">All role credentials and owner-code generation are available to a person with access to the same OS account, so this prototype demonstrates tool authorization rather than independent production identity. The loopback standard-library server must not be exposed publicly. Production needs independent identity/code delivery, rate limiting and monitoring, encrypted storage, reviewed jurisdiction rules, institution authentication, immutable third-party evidence and reconciliation for real failures. The TypeSafe model alias is not pinned; remote availability and general classification accuracy are unmeasured. No professional reviewed this as an individual estate filing. Topic A acceptance and team eligibility remain unconfirmed; the team will complete those administrative steps.</w:t>
+        <w:t xml:space="preserve">All role credentials and owner-code generation are available to a person with access to the same OS account, so this prototype demonstrates tool authorization rather than independent production identity. The loopback standard-library server must not be exposed publicly. Production needs independent identity/code delivery, rate limiting and monitoring, encrypted storage, reviewed jurisdiction rules, institution authentication, immutable third-party evidence and reconciliation for real failures. The TypeSafe model alias is not pinned; remote availability and general classification accuracy are unmeasured. No professional reviewed this as an individual estate filing. Topic B acceptance and team eligibility remain unconfirmed; the team will complete those administrative steps.</w:t>
       </w:r>
     </w:p>
     <w:sectPr>

</xml_diff>